<commit_message>
Add spot detail article workflow
</commit_message>
<xml_diff>
--- a/article-workspace/hidden-japan-travel/01-hidden-historic-places-in-japan/Eiji_check/hidden_historic_places_outline_ja_for_eiji_check.docx
+++ b/article-workspace/hidden-japan-travel/01-hidden-historic-places-in-japan/Eiji_check/hidden_historic_places_outline_ja_for_eiji_check.docx
@@ -130,6 +130,35 @@
       </w:r>
     </w:p>
     <w:p>
+      <w:pPr>
+        <w:pStyle w:val="BodyText"/>
+      </w:pPr>
+      <w:r>
+        <w:rPr>
+          <w:rFonts w:hint="eastAsia"/>
+        </w:rPr>
+        <w:t xml:space="preserve">また、この記事は入口記事です。本文中に出てくる</w:t>
+      </w:r>
+      <w:r>
+        <w:t xml:space="preserve"> </w:t>
+      </w:r>
+      <w:r>
+        <w:rPr>
+          <w:rStyle w:val="VerbatimChar"/>
+        </w:rPr>
+        <w:t xml:space="preserve">Odawara Castle</w:t>
+      </w:r>
+      <w:r>
+        <w:t xml:space="preserve"> </w:t>
+      </w:r>
+      <w:r>
+        <w:rPr>
+          <w:rFonts w:hint="eastAsia"/>
+        </w:rPr>
+        <w:t xml:space="preserve">などのスポット名は、将来的にそれぞれの詳細記事へリンクします。詳細記事では、詳しい歴史、具体的な観光の仕方、食事どころ、ホテル、写真を扱います。</w:t>
+      </w:r>
+    </w:p>
+    <w:p>
       <w:r>
         <w:pict>
           <v:rect style="width:0;height:1.5pt" o:hralign="center" o:hrstd="t" o:hr="t"/>
@@ -1979,6 +2008,21 @@
           <w:rFonts w:hint="eastAsia"/>
         </w:rPr>
         <w:t xml:space="preserve">将来、単独記事にすべき場所はどれか</w:t>
+      </w:r>
+    </w:p>
+    <w:p>
+      <w:pPr>
+        <w:pStyle w:val="Compact"/>
+        <w:numPr>
+          <w:ilvl w:val="0"/>
+          <w:numId w:val="1018"/>
+        </w:numPr>
+      </w:pPr>
+      <w:r>
+        <w:rPr>
+          <w:rFonts w:hint="eastAsia"/>
+        </w:rPr>
+        <w:t xml:space="preserve">各スポットの詳細記事で、食事・宿泊まで扱うことに違和感がないか</w:t>
       </w:r>
     </w:p>
     <w:p>

</xml_diff>